<commit_message>
feat: agregar temas claro y oscuro en WPF
</commit_message>
<xml_diff>
--- a/docs/informe/Informe_Final_Proyecto2_Equipo5.docx
+++ b/docs/informe/Informe_Final_Proyecto2_Equipo5.docx
@@ -1986,17 +1986,8 @@
             <w:vAlign w:val="center"/>
           </w:tcPr>
           <w:p>
-            <w:pPr>
-              <w:spacing w:before="0" w:after="0" w:line="240" w:lineRule="auto"/>
-            </w:pPr>
             <w:r>
-              <w:rPr>
-                <w:rFonts w:ascii="Times New Roman" w:hAnsi="Times New Roman" w:eastAsia="Times New Roman"/>
-                <w:b w:val="0"/>
-                <w:i w:val="0"/>
-                <w:sz w:val="18"/>
-              </w:rPr>
-              <w:t>Sin evidencia técnica independiente registrada en el cierre revisado</w:t>
+              <w:t>Revisión de interfaz WPF y propuesta de modo claro/oscuro</w:t>
             </w:r>
           </w:p>
         </w:tc>
@@ -2006,17 +1997,8 @@
             <w:vAlign w:val="center"/>
           </w:tcPr>
           <w:p>
-            <w:pPr>
-              <w:spacing w:before="0" w:after="0" w:line="240" w:lineRule="auto"/>
-            </w:pPr>
             <w:r>
-              <w:rPr>
-                <w:rFonts w:ascii="Times New Roman" w:hAnsi="Times New Roman" w:eastAsia="Times New Roman"/>
-                <w:b w:val="0"/>
-                <w:i w:val="0"/>
-                <w:sz w:val="18"/>
-              </w:rPr>
-              <w:t>Rol asignado a WPF, pendiente de evidencia específica en bitácora si corresponde.</w:t>
+              <w:t>Aporte de análisis visual y propuesta de mejora de accesibilidad visual. La propuesta fue revisada e integrada en el cierre mediante temas dinámicos en WPF.</w:t>
             </w:r>
           </w:p>
         </w:tc>
@@ -6099,6 +6081,14 @@
     </w:p>
     <w:p>
       <w:pPr>
+        <w:pStyle w:val="31"/>
+      </w:pPr>
+      <w:r>
+        <w:t>alternancia visual entre tema oscuro y tema claro mediante recursos dinámicos de WPF.</w:t>
+      </w:r>
+    </w:p>
+    <w:p>
+      <w:pPr>
         <w:spacing w:before="0" w:after="0" w:line="480" w:lineRule="auto"/>
       </w:pPr>
       <w:r>
@@ -6113,6 +6103,26 @@
     </w:p>
     <w:p>
       <w:pPr>
+        <w:pStyle w:val="3"/>
+      </w:pPr>
+      <w:r>
+        <w:t>Tema claro y oscuro</w:t>
+      </w:r>
+    </w:p>
+    <w:p>
+      <w:pPr/>
+      <w:r>
+        <w:t>Durante la revisión final se implementó cambio dinámico entre tema oscuro y tema claro en WPF. La mejora es valiosa desde el punto de vista de accesibilidad visual, ya que permite adaptar la interfaz a usuarios que requieran mayor claridad, contraste diferente o menor fatiga visual.</w:t>
+      </w:r>
+    </w:p>
+    <w:p>
+      <w:pPr/>
+      <w:r>
+        <w:t>La implementación utiliza diccionarios de recursos DarkTheme.xaml y LightTheme.xaml, cargados desde App.xaml. La clase App expone el cambio de tema y MainWindow incorpora un botón para alternar entre ambos modos. Las vistas principales reemplazaron colores fijos por DynamicResource, de forma que el cambio se aplica en cuentas bancarias, nueva orden y ventanas de búsqueda.</w:t>
+      </w:r>
+    </w:p>
+    <w:p>
+      <w:pPr>
         <w:pStyle w:val="2"/>
         <w:keepNext/>
         <w:spacing w:line="480" w:lineRule="auto"/>
@@ -6155,7 +6165,9 @@
           <w:i w:val="0"/>
           <w:sz w:val="24"/>
         </w:rPr>
-        <w:t>Para cerrar la entrega, falta anexar las capturas manuales de WPF y exportar este informe a PDF. La evidencia de API, inventario y rollback ya fue registrada contra SQL Server del curso.</w:t>
+      </w:r>
+      <w:r>
+        <w:t>La versión final incorpora además pruebas unitarias de la capa de negocio, validación del archivo .http, fecha visible en la orden, código de producto en la matriz de detalle y alternancia visual entre tema oscuro y tema claro. Para cerrar la entrega administrativa, falta anexar las capturas manuales de WPF y exportar este informe a PDF. La evidencia de API, inventario y rollback ya fue registrada contra SQL Server del curso.</w:t>
       </w:r>
     </w:p>
     <w:p>

</xml_diff>